<commit_message>
Change contact email from admin@ to info@seniornavigator.ca
Updated across the website, letterhead (HTML/PDF/Word) and docs.

Co-Authored-By: Claude Opus 4.8 <noreply@anthropic.com>
</commit_message>
<xml_diff>
--- a/letterhead/SeniorNavigator-Letterhead.docx
+++ b/letterhead/SeniorNavigator-Letterhead.docx
@@ -261,7 +261,7 @@
         <w:sz w:val="15"/>
         <w:szCs w:val="15"/>
       </w:rPr>
-      <w:t xml:space="preserve">448 Gibraltar Drive, Unit 9, Mississauga, ON L5T 2N8   ·   +1 (437) 559-2990   ·   admin@seniornavigator.ca   ·   www.seniornavigator.ca</w:t>
+      <w:t xml:space="preserve">448 Gibraltar Drive, Unit 9, Mississauga, ON L5T 2N8   ·   +1 (437) 559-2990   ·   info@seniornavigator.ca   ·   www.seniornavigator.ca</w:t>
     </w:r>
   </w:p>
   <w:p>
@@ -516,7 +516,7 @@
               <w:sz w:val="18"/>
               <w:szCs w:val="18"/>
             </w:rPr>
-            <w:t xml:space="preserve">admin@seniornavigator.ca</w:t>
+            <w:t xml:space="preserve">info@seniornavigator.ca</w:t>
           </w:r>
         </w:p>
         <w:p>

</xml_diff>

<commit_message>
Make Word letterhead pixel-match the PDF
Rebuild SeniorNavigator-Letterhead.docx using the exact letterhead
artwork (spine, masthead, contact icons, watermark, footer badge) as a
full-page background image in the header, with an editable letter body.

Co-Authored-By: Claude Opus 4.8 <noreply@anthropic.com>
</commit_message>
<xml_diff>
--- a/letterhead/SeniorNavigator-Letterhead.docx
+++ b/letterhead/SeniorNavigator-Letterhead.docx
@@ -3,13 +3,8 @@
 <w:document xmlns:wpc="http://schemas.microsoft.com/office/word/2010/wordprocessingCanvas" xmlns:mc="http://schemas.openxmlformats.org/markup-compatibility/2006" xmlns:o="urn:schemas-microsoft-com:office:office" xmlns:r="http://schemas.openxmlformats.org/officeDocument/2006/relationships" xmlns:m="http://schemas.openxmlformats.org/officeDocument/2006/math" xmlns:v="urn:schemas-microsoft-com:vml" xmlns:wp14="http://schemas.microsoft.com/office/word/2010/wordprocessingDrawing" xmlns:wp="http://schemas.openxmlformats.org/drawingml/2006/wordprocessingDrawing" xmlns:w10="urn:schemas-microsoft-com:office:word" xmlns:w="http://schemas.openxmlformats.org/wordprocessingml/2006/main" xmlns:w14="http://schemas.microsoft.com/office/word/2010/wordml" xmlns:w15="http://schemas.microsoft.com/office/word/2012/wordml" xmlns:wpg="http://schemas.microsoft.com/office/word/2010/wordprocessingGroup" xmlns:wpi="http://schemas.microsoft.com/office/word/2010/wordprocessingInk" xmlns:wne="http://schemas.microsoft.com/office/word/2006/wordml" xmlns:wps="http://schemas.microsoft.com/office/word/2010/wordprocessingShape" xmlns:cx="http://schemas.microsoft.com/office/drawing/2014/chartex" xmlns:cx1="http://schemas.microsoft.com/office/drawing/2015/9/8/chartex" xmlns:cx2="http://schemas.microsoft.com/office/drawing/2015/10/21/chartex" xmlns:cx3="http://schemas.microsoft.com/office/drawing/2016/5/9/chartex" xmlns:cx4="http://schemas.microsoft.com/office/drawing/2016/5/10/chartex" xmlns:cx5="http://schemas.microsoft.com/office/drawing/2016/5/11/chartex" xmlns:cx6="http://schemas.microsoft.com/office/drawing/2016/5/12/chartex" xmlns:cx7="http://schemas.microsoft.com/office/drawing/2016/5/13/chartex" xmlns:cx8="http://schemas.microsoft.com/office/drawing/2016/5/14/chartex" xmlns:aink="http://schemas.microsoft.com/office/drawing/2016/ink" xmlns:am3d="http://schemas.microsoft.com/office/drawing/2017/model3d" xmlns:w16cex="http://schemas.microsoft.com/office/word/2018/wordml/cex" xmlns:w16cid="http://schemas.microsoft.com/office/word/2016/wordml/cid" xmlns:w16="http://schemas.microsoft.com/office/word/2018/wordml" xmlns:w16sdtdh="http://schemas.microsoft.com/office/word/2020/wordml/sdtdatahash" xmlns:w16se="http://schemas.microsoft.com/office/word/2015/wordml/symex" mc:Ignorable="w14 w15 wp14">
   <w:body>
     <w:p>
-      <w:r>
-        <w:t xml:space="preserve"/>
-      </w:r>
-    </w:p>
-    <w:p>
-      <w:pPr>
-        <w:spacing w:after="120"/>
+      <w:pPr>
+        <w:spacing w:after="140"/>
       </w:pPr>
       <w:r>
         <w:rPr>
@@ -21,11 +16,6 @@
       </w:r>
     </w:p>
     <w:p>
-      <w:r>
-        <w:t xml:space="preserve"/>
-      </w:r>
-    </w:p>
-    <w:p>
       <w:pPr>
         <w:spacing w:after="0"/>
       </w:pPr>
@@ -53,7 +43,7 @@
     </w:p>
     <w:p>
       <w:pPr>
-        <w:spacing w:after="160"/>
+        <w:spacing w:after="200"/>
       </w:pPr>
       <w:r>
         <w:rPr>
@@ -66,7 +56,7 @@
     </w:p>
     <w:p>
       <w:pPr>
-        <w:spacing w:after="160"/>
+        <w:spacing w:after="200"/>
       </w:pPr>
       <w:r>
         <w:rPr>
@@ -77,7 +67,7 @@
     </w:p>
     <w:p>
       <w:pPr>
-        <w:spacing w:after="160" w:line="300"/>
+        <w:spacing w:after="200" w:line="300"/>
       </w:pPr>
       <w:r>
         <w:rPr>
@@ -85,46 +75,48 @@
           <w:iCs/>
           <w:color w:val="9AA6AB"/>
         </w:rPr>
-        <w:t xml:space="preserve">Begin your letter here. This template carries the SeniorNavigator letterhead and footer on every page — simply replace the bracketed placeholders and type your message. To keep the premium look, leave the header, footer and margins unchanged.</w:t>
-      </w:r>
-    </w:p>
-    <w:p>
+        <w:t xml:space="preserve">Begin your letter here. This letterhead repeats on every page — simply replace the bracketed placeholders and type your message. Leave the header, footer and margins unchanged to keep the premium layout.</w:t>
+      </w:r>
+    </w:p>
+    <w:p>
+      <w:pPr>
+        <w:spacing w:after="0"/>
+      </w:pPr>
       <w:r>
         <w:t xml:space="preserve"/>
       </w:r>
     </w:p>
     <w:p>
+      <w:pPr>
+        <w:spacing w:after="0"/>
+      </w:pPr>
       <w:r>
         <w:t xml:space="preserve"/>
       </w:r>
     </w:p>
     <w:p>
+      <w:pPr>
+        <w:spacing w:after="0"/>
+      </w:pPr>
+      <w:r>
+        <w:rPr>
+          <w:color w:val="22323A"/>
+        </w:rPr>
+        <w:t xml:space="preserve">With warm regards,</w:t>
+      </w:r>
+    </w:p>
+    <w:p>
+      <w:pPr>
+        <w:spacing w:after="0"/>
+      </w:pPr>
       <w:r>
         <w:t xml:space="preserve"/>
       </w:r>
     </w:p>
     <w:p>
-      <w:r>
-        <w:t xml:space="preserve"/>
-      </w:r>
-    </w:p>
-    <w:p>
-      <w:pPr>
-        <w:spacing w:after="0"/>
-      </w:pPr>
-      <w:r>
-        <w:rPr>
-          <w:color w:val="22323A"/>
-        </w:rPr>
-        <w:t xml:space="preserve">With warm regards,</w:t>
-      </w:r>
-    </w:p>
-    <w:p>
-      <w:r>
-        <w:t xml:space="preserve"/>
-      </w:r>
-    </w:p>
-    <w:p>
+      <w:pPr>
+        <w:spacing w:after="0"/>
+      </w:pPr>
       <w:r>
         <w:t xml:space="preserve"/>
       </w:r>
@@ -160,7 +152,7 @@
       <w:headerReference w:type="default" r:id="rId7"/>
       <w:footerReference w:type="default" r:id="rId8"/>
       <w:pgSz w:w="12240" w:h="15840" w:orient="portrait"/>
-      <w:pgMar w:top="2200" w:right="1080" w:bottom="1700" w:left="1080" w:header="560" w:footer="460" w:gutter="0"/>
+      <w:pgMar w:top="2664" w:right="1152" w:bottom="1512" w:left="1224" w:header="432" w:footer="432" w:gutter="0"/>
       <w:pgNumType/>
       <w:docGrid w:linePitch="360"/>
     </w:sectPr>
@@ -212,72 +204,8 @@
 <file path=word/footer1.xml><?xml version="1.0" encoding="utf-8"?>
 <w:ftr xmlns:wpc="http://schemas.microsoft.com/office/word/2010/wordprocessingCanvas" xmlns:mc="http://schemas.openxmlformats.org/markup-compatibility/2006" xmlns:o="urn:schemas-microsoft-com:office:office" xmlns:r="http://schemas.openxmlformats.org/officeDocument/2006/relationships" xmlns:m="http://schemas.openxmlformats.org/officeDocument/2006/math" xmlns:v="urn:schemas-microsoft-com:vml" xmlns:wp14="http://schemas.microsoft.com/office/word/2010/wordprocessingDrawing" xmlns:wp="http://schemas.openxmlformats.org/drawingml/2006/wordprocessingDrawing" xmlns:w10="urn:schemas-microsoft-com:office:word" xmlns:w="http://schemas.openxmlformats.org/wordprocessingml/2006/main" xmlns:w14="http://schemas.microsoft.com/office/word/2010/wordml" xmlns:w15="http://schemas.microsoft.com/office/word/2012/wordml" xmlns:wpg="http://schemas.microsoft.com/office/word/2010/wordprocessingGroup" xmlns:wpi="http://schemas.microsoft.com/office/word/2010/wordprocessingInk" xmlns:wne="http://schemas.microsoft.com/office/word/2006/wordml" xmlns:wps="http://schemas.microsoft.com/office/word/2010/wordprocessingShape">
   <w:p>
-    <w:pPr>
-      <w:pBdr>
-        <w:top w:val="single" w:color="C9A24B" w:sz="14" w:space="6"/>
-      </w:pBdr>
-      <w:spacing w:after="30" w:before="60"/>
-      <w:jc w:val="center"/>
-    </w:pPr>
     <w:r>
-      <w:rPr>
-        <w:rFonts w:ascii="Calibri" w:cs="Calibri" w:eastAsia="Calibri" w:hAnsi="Calibri"/>
-        <w:b/>
-        <w:bCs/>
-        <w:color w:val="0C4A5A"/>
-        <w:sz w:val="16"/>
-        <w:szCs w:val="16"/>
-      </w:rPr>
-      <w:t xml:space="preserve">SeniorNavigator Services Limited</w:t>
-    </w:r>
-    <w:r>
-      <w:rPr>
-        <w:rFonts w:ascii="Calibri" w:cs="Calibri" w:eastAsia="Calibri" w:hAnsi="Calibri"/>
-        <w:color w:val="A6792E"/>
-        <w:sz w:val="15"/>
-        <w:szCs w:val="15"/>
-      </w:rPr>
-      <w:t xml:space="preserve">   ·   </w:t>
-    </w:r>
-    <w:r>
-      <w:rPr>
-        <w:rFonts w:ascii="Calibri" w:cs="Calibri" w:eastAsia="Calibri" w:hAnsi="Calibri"/>
-        <w:color w:val="5C6F77"/>
-        <w:sz w:val="16"/>
-        <w:szCs w:val="16"/>
-      </w:rPr>
-      <w:t xml:space="preserve">Ontario Corporation No. 1001484077</w:t>
-    </w:r>
-  </w:p>
-  <w:p>
-    <w:pPr>
-      <w:spacing w:after="30"/>
-      <w:jc w:val="center"/>
-    </w:pPr>
-    <w:r>
-      <w:rPr>
-        <w:rFonts w:ascii="Calibri" w:cs="Calibri" w:eastAsia="Calibri" w:hAnsi="Calibri"/>
-        <w:color w:val="5C6F77"/>
-        <w:sz w:val="15"/>
-        <w:szCs w:val="15"/>
-      </w:rPr>
-      <w:t xml:space="preserve">448 Gibraltar Drive, Unit 9, Mississauga, ON L5T 2N8   ·   +1 (437) 559-2990   ·   info@seniornavigator.ca   ·   www.seniornavigator.ca</w:t>
-    </w:r>
-  </w:p>
-  <w:p>
-    <w:pPr>
-      <w:jc w:val="center"/>
-    </w:pPr>
-    <w:r>
-      <w:rPr>
-        <w:rFonts w:ascii="Calibri" w:cs="Calibri" w:eastAsia="Calibri" w:hAnsi="Calibri"/>
-        <w:b/>
-        <w:bCs/>
-        <w:color w:val="A6792E"/>
-        <w:sz w:val="13"/>
-        <w:szCs w:val="13"/>
-      </w:rPr>
-      <w:t xml:space="preserve">N O N - M E D I C A L   S E N I O R   S U P P O R T      ·      E N G L I S H   ·   U R D U   ·   P A S H T O</w:t>
+      <w:t xml:space="preserve"/>
     </w:r>
   </w:p>
 </w:ftr>
@@ -328,18 +256,18 @@
     </w:pPr>
     <w:r>
       <w:drawing>
-        <wp:anchor distT="0" distB="0" distL="0" distR="0" simplePos="0" allowOverlap="1" behindDoc="1" locked="0" layoutInCell="1" relativeHeight="4095750">
+        <wp:anchor distT="0" distB="0" distL="0" distR="0" simplePos="0" allowOverlap="1" behindDoc="1" locked="0" layoutInCell="1" relativeHeight="10058400">
           <wp:simplePos x="0" y="0"/>
           <wp:positionH relativeFrom="page">
-            <wp:align>center</wp:align>
+            <wp:posOffset>0</wp:posOffset>
           </wp:positionH>
           <wp:positionV relativeFrom="page">
-            <wp:align>center</wp:align>
+            <wp:posOffset>0</wp:posOffset>
           </wp:positionV>
-          <wp:extent cx="4095750" cy="4095750"/>
+          <wp:extent cx="7772400" cy="10058400"/>
           <wp:effectExtent t="0" r="0" b="0" l="0"/>
           <wp:wrapNone/>
-          <wp:docPr id="1" name="Watermark" descr="Faint compass watermark" title="Compass watermark"/>
+          <wp:docPr id="1" name="Letterhead" descr="SeniorNavigator Services branded letterhead" title="SeniorNavigator Services letterhead"/>
           <wp:cNvGraphicFramePr>
             <a:graphicFrameLocks xmlns:a="http://schemas.openxmlformats.org/drawingml/2006/main" noChangeAspect="1"/>
           </wp:cNvGraphicFramePr>
@@ -362,7 +290,7 @@
                 <pic:spPr bwMode="auto">
                   <a:xfrm>
                     <a:off x="0" y="0"/>
-                    <a:ext cx="4095750" cy="4095750"/>
+                    <a:ext cx="7772400" cy="10058400"/>
                   </a:xfrm>
                   <a:prstGeom prst="rect">
                     <a:avLst/>
@@ -373,202 +301,6 @@
           </a:graphic>
         </wp:anchor>
       </w:drawing>
-    </w:r>
-  </w:p>
-  <w:tbl>
-    <w:tblPr>
-      <w:tblW w:type="dxa" w:w="10080"/>
-      <w:tblBorders>
-        <w:top w:val="none" w:color="FFFFFF" w:sz="0"/>
-        <w:left w:val="none" w:color="FFFFFF" w:sz="0"/>
-        <w:bottom w:val="none" w:color="FFFFFF" w:sz="0"/>
-        <w:right w:val="none" w:color="FFFFFF" w:sz="0"/>
-        <w:insideH w:val="none" w:color="FFFFFF" w:sz="0"/>
-        <w:insideV w:val="none" w:color="FFFFFF" w:sz="0"/>
-      </w:tblBorders>
-    </w:tblPr>
-    <w:tblGrid>
-      <w:gridCol w:w="6180"/>
-      <w:gridCol w:w="3900"/>
-    </w:tblGrid>
-    <w:tr>
-      <w:tc>
-        <w:tcPr>
-          <w:tcW w:type="dxa" w:w="6180"/>
-          <w:tcBorders>
-            <w:top w:val="none" w:color="FFFFFF" w:sz="0"/>
-            <w:left w:val="none" w:color="FFFFFF" w:sz="0"/>
-            <w:bottom w:val="none" w:color="FFFFFF" w:sz="0"/>
-            <w:right w:val="none" w:color="FFFFFF" w:sz="0"/>
-          </w:tcBorders>
-          <w:tcMar>
-            <w:top w:type="dxa" w:w="0"/>
-            <w:left w:type="dxa" w:w="0"/>
-            <w:bottom w:type="dxa" w:w="0"/>
-            <w:right w:type="dxa" w:w="80"/>
-          </w:tcMar>
-          <w:vAlign w:val="center"/>
-        </w:tcPr>
-        <w:p>
-          <w:pPr>
-            <w:spacing w:after="40"/>
-          </w:pPr>
-          <w:r>
-            <w:drawing>
-              <wp:inline distT="0" distB="0" distL="0" distR="0">
-                <wp:extent cx="2743200" cy="733425"/>
-                <wp:effectExtent t="0" r="0" b="0" l="0"/>
-                <wp:docPr id="1" name="Logo" descr="SeniorNavigator Services logo" title="SeniorNavigator Services"/>
-                <wp:cNvGraphicFramePr>
-                  <a:graphicFrameLocks xmlns:a="http://schemas.openxmlformats.org/drawingml/2006/main" noChangeAspect="1"/>
-                </wp:cNvGraphicFramePr>
-                <a:graphic xmlns:a="http://schemas.openxmlformats.org/drawingml/2006/main">
-                  <a:graphicData uri="http://schemas.openxmlformats.org/drawingml/2006/picture">
-                    <pic:pic xmlns:pic="http://schemas.openxmlformats.org/drawingml/2006/picture">
-                      <pic:nvPicPr>
-                        <pic:cNvPr id="0" name="" descr=""/>
-                        <pic:cNvPicPr>
-                          <a:picLocks noChangeAspect="1" noChangeArrowheads="1"/>
-                        </pic:cNvPicPr>
-                      </pic:nvPicPr>
-                      <pic:blipFill>
-                        <a:blip r:embed="rId1" cstate="none"/>
-                        <a:srcRect/>
-                        <a:stretch>
-                          <a:fillRect/>
-                        </a:stretch>
-                      </pic:blipFill>
-                      <pic:spPr bwMode="auto">
-                        <a:xfrm>
-                          <a:off x="0" y="0"/>
-                          <a:ext cx="2743200" cy="733425"/>
-                        </a:xfrm>
-                        <a:prstGeom prst="rect">
-                          <a:avLst/>
-                        </a:prstGeom>
-                      </pic:spPr>
-                    </pic:pic>
-                  </a:graphicData>
-                </a:graphic>
-              </wp:inline>
-            </w:drawing>
-          </w:r>
-        </w:p>
-        <w:p>
-          <w:r>
-            <w:rPr>
-              <w:rFonts w:ascii="Georgia" w:cs="Georgia" w:eastAsia="Georgia" w:hAnsi="Georgia"/>
-              <w:i/>
-              <w:iCs/>
-              <w:color w:val="5C6F77"/>
-              <w:sz w:val="17"/>
-              <w:szCs w:val="17"/>
-            </w:rPr>
-            <w:t xml:space="preserve">By your side, every step of the way.</w:t>
-          </w:r>
-        </w:p>
-      </w:tc>
-      <w:tc>
-        <w:tcPr>
-          <w:tcW w:type="dxa" w:w="3900"/>
-          <w:tcBorders>
-            <w:top w:val="none" w:color="FFFFFF" w:sz="0"/>
-            <w:left w:val="none" w:color="FFFFFF" w:sz="0"/>
-            <w:bottom w:val="none" w:color="FFFFFF" w:sz="0"/>
-            <w:right w:val="none" w:color="FFFFFF" w:sz="0"/>
-          </w:tcBorders>
-          <w:tcMar>
-            <w:top w:type="dxa" w:w="0"/>
-            <w:left w:type="dxa" w:w="80"/>
-            <w:bottom w:type="dxa" w:w="0"/>
-            <w:right w:type="dxa" w:w="0"/>
-          </w:tcMar>
-          <w:vAlign w:val="center"/>
-        </w:tcPr>
-        <w:p>
-          <w:pPr>
-            <w:spacing w:after="18" w:line="240"/>
-            <w:jc w:val="right"/>
-          </w:pPr>
-          <w:r>
-            <w:rPr>
-              <w:rFonts w:ascii="Calibri" w:cs="Calibri" w:eastAsia="Calibri" w:hAnsi="Calibri"/>
-              <w:b/>
-              <w:bCs/>
-              <w:color w:val="0C4A5A"/>
-              <w:sz w:val="21"/>
-              <w:szCs w:val="21"/>
-            </w:rPr>
-            <w:t xml:space="preserve">+1 (437) 559-2990</w:t>
-          </w:r>
-        </w:p>
-        <w:p>
-          <w:pPr>
-            <w:spacing w:after="18" w:line="240"/>
-            <w:jc w:val="right"/>
-          </w:pPr>
-          <w:r>
-            <w:rPr>
-              <w:rFonts w:ascii="Calibri" w:cs="Calibri" w:eastAsia="Calibri" w:hAnsi="Calibri"/>
-              <w:b w:val="false"/>
-              <w:bCs w:val="false"/>
-              <w:color w:val="5C6F77"/>
-              <w:sz w:val="18"/>
-              <w:szCs w:val="18"/>
-            </w:rPr>
-            <w:t xml:space="preserve">info@seniornavigator.ca</w:t>
-          </w:r>
-        </w:p>
-        <w:p>
-          <w:pPr>
-            <w:spacing w:after="18" w:line="240"/>
-            <w:jc w:val="right"/>
-          </w:pPr>
-          <w:r>
-            <w:rPr>
-              <w:rFonts w:ascii="Calibri" w:cs="Calibri" w:eastAsia="Calibri" w:hAnsi="Calibri"/>
-              <w:b w:val="false"/>
-              <w:bCs w:val="false"/>
-              <w:color w:val="5C6F77"/>
-              <w:sz w:val="18"/>
-              <w:szCs w:val="18"/>
-            </w:rPr>
-            <w:t xml:space="preserve">www.seniornavigator.ca</w:t>
-          </w:r>
-        </w:p>
-        <w:p>
-          <w:pPr>
-            <w:spacing w:after="18" w:line="240"/>
-            <w:jc w:val="right"/>
-          </w:pPr>
-          <w:r>
-            <w:rPr>
-              <w:rFonts w:ascii="Calibri" w:cs="Calibri" w:eastAsia="Calibri" w:hAnsi="Calibri"/>
-              <w:b w:val="false"/>
-              <w:bCs w:val="false"/>
-              <w:color w:val="5C6F77"/>
-              <w:sz w:val="18"/>
-              <w:szCs w:val="18"/>
-            </w:rPr>
-            <w:t xml:space="preserve">Mississauga, Ontario</w:t>
-          </w:r>
-        </w:p>
-      </w:tc>
-    </w:tr>
-  </w:tbl>
-  <w:p>
-    <w:pPr>
-      <w:pBdr>
-        <w:bottom w:val="single" w:color="C9A24B" w:sz="18" w:space="2"/>
-      </w:pBdr>
-      <w:spacing w:after="0" w:before="80"/>
-    </w:pPr>
-    <w:r>
-      <w:rPr>
-        <w:sz w:val="2"/>
-        <w:szCs w:val="2"/>
-      </w:rPr>
-      <w:t xml:space="preserve"/>
     </w:r>
   </w:p>
 </w:hdr>

</xml_diff>